<commit_message>
docs(manuscript): replace ASCII DAG with high-resolution publication and presentation figures
</commit_message>
<xml_diff>
--- a/manuscript/manuscript.docx
+++ b/manuscript/manuscript.docx
@@ -2147,71 +2147,56 @@
     </w:p>
     <w:p>
       <w:pPr>
-        <w:spacing w:before="120" w:after="120" w:line="252" w:lineRule="auto"/>
-      </w:pPr>
-      <w:r>
-        <w:rPr>
-          <w:rFonts w:ascii="Consolas" w:hAnsi="Consolas"/>
-          <w:color w:val="282828"/>
-          <w:sz w:val="16"/>
-        </w:rPr>
-        <w:t>┌────────────────────────────────────────────────────────────────────────────────────────┐</w:t>
-        <w:br/>
-        <w:t>│                 GENERATIVE DIRECTED ACYCLIC GRAPH (DAG) OF BAYESIAN MODEL               │</w:t>
-        <w:br/>
-        <w:t>├────────────────────────────────────────────────────────────────────────────────────────┤</w:t>
-        <w:br/>
-        <w:t>│                                                                                        │</w:t>
-        <w:br/>
-        <w:t>│   [ Hyperpriors ]                                                                      │</w:t>
-        <w:br/>
-        <w:t>│        τ_β ~ Half-Normal(0, 0.05)         τ_γ ~ Half-Normal(0, 0.05)                    │</w:t>
-        <w:br/>
-        <w:t>│                 │                                  │                                   │</w:t>
-        <w:br/>
-        <w:t>│                 ▼                                  ▼                                   │</w:t>
-        <w:br/>
-        <w:t>│   [ Non-Centered Parameters ]                                                          │</w:t>
-        <w:br/>
-        <w:t>│        β_d = τ_β · z_β                     γ_s = τ_γ · z_γ                             │</w:t>
-        <w:br/>
-        <w:t>│        z_β ~ Normal(0, 1)                  z_γ ~ Normal(0, 1)                          │</w:t>
-        <w:br/>
-        <w:t>│        (Disease Effect)                    (Site Random Intercept)                     │</w:t>
-        <w:br/>
-        <w:t>│                 │                                  │                                   │</w:t>
-        <w:br/>
-        <w:t>│                 └──────────────┬───────────────────┘                                   │</w:t>
-        <w:br/>
-        <w:t>│                                │                                                       │</w:t>
-        <w:br/>
-        <w:t>│                                ▼                                                       │</w:t>
-        <w:br/>
-        <w:t>│   [ Linear Predictor ]                                                                 │</w:t>
-        <w:br/>
-        <w:t>│        μ_i = α + β_{diagnosis[i]} + γ_{site[i]} + δ · Contrast_i                       │</w:t>
-        <w:br/>
-        <w:t>│                                │                                                       │</w:t>
-        <w:br/>
-        <w:t>│                                ▼                                                       │</w:t>
-        <w:br/>
-        <w:t>│   [ Likelihood ]                                                                       │</w:t>
-        <w:br/>
-        <w:t>│        y_i ~ Normal( μ_i,  σ_i² )                                                      │</w:t>
-        <w:br/>
-        <w:t>│                                ▲                                                       │</w:t>
-        <w:br/>
-        <w:t>│                                │                                                       │</w:t>
-        <w:br/>
-        <w:t>│   [ Heteroskedastic Dispersion ]                                                       │</w:t>
-        <w:br/>
-        <w:t>│        σ_i = σ_0 · exp( λ · [SliceThickness_i - 1.0] )                                 │</w:t>
-        <w:br/>
-        <w:t>│        σ_0 ~ Half-Normal(0, 0.05)         λ ~ Normal(0, 0.15)                          │</w:t>
-        <w:br/>
-        <w:t>│                                                                                        │</w:t>
-        <w:br/>
-        <w:t>└────────────────────────────────────────────────────────────────────────────────────────┘</w:t>
+        <w:spacing w:before="240" w:after="80"/>
+        <w:jc w:val="center"/>
+      </w:pPr>
+      <w:r>
+        <w:drawing>
+          <wp:inline xmlns:a="http://schemas.openxmlformats.org/drawingml/2006/main" xmlns:pic="http://schemas.openxmlformats.org/drawingml/2006/picture">
+            <wp:extent cx="5669280" cy="3664368"/>
+            <wp:docPr id="1" name="Picture 1"/>
+            <wp:cNvGraphicFramePr>
+              <a:graphicFrameLocks noChangeAspect="1"/>
+            </wp:cNvGraphicFramePr>
+            <a:graphic>
+              <a:graphicData uri="http://schemas.openxmlformats.org/drawingml/2006/picture">
+                <pic:pic>
+                  <pic:nvPicPr>
+                    <pic:cNvPr id="0" name="figure_dag_model.png"/>
+                    <pic:cNvPicPr/>
+                  </pic:nvPicPr>
+                  <pic:blipFill>
+                    <a:blip r:embed="rId9"/>
+                    <a:stretch>
+                      <a:fillRect/>
+                    </a:stretch>
+                  </pic:blipFill>
+                  <pic:spPr>
+                    <a:xfrm>
+                      <a:off x="0" y="0"/>
+                      <a:ext cx="5669280" cy="3664368"/>
+                    </a:xfrm>
+                    <a:prstGeom prst="rect"/>
+                  </pic:spPr>
+                </pic:pic>
+              </a:graphicData>
+            </a:graphic>
+          </wp:inline>
+        </w:drawing>
+      </w:r>
+    </w:p>
+    <w:p>
+      <w:pPr>
+        <w:spacing w:before="40" w:after="280"/>
+        <w:jc w:val="center"/>
+      </w:pPr>
+      <w:r>
+        <w:rPr>
+          <w:i/>
+          <w:color w:val="505050"/>
+          <w:sz w:val="19"/>
+        </w:rPr>
+        <w:t>Figure: Generative Directed Acyclic Graph (DAG) of the Bayesian Hierarchical Framework. The model hierarchically estimates disease-specific morphometric deviations $\beta_d$ and inter-scanner baseline offsets $\gamma_s$ using non-centered parameterizations, while incorporating an explicit gadolinium contrast shift $\delta$ and an exponential heteroskedastic dispersion model $\sigma_i$ that scales measurement error variance as a function of clinical slice thickness.</w:t>
       </w:r>
     </w:p>
     <w:p>
@@ -3870,7 +3855,7 @@
         <w:drawing>
           <wp:inline xmlns:a="http://schemas.openxmlformats.org/drawingml/2006/main" xmlns:pic="http://schemas.openxmlformats.org/drawingml/2006/picture">
             <wp:extent cx="5669280" cy="2229002"/>
-            <wp:docPr id="1" name="Picture 1"/>
+            <wp:docPr id="2" name="Picture 2"/>
             <wp:cNvGraphicFramePr>
               <a:graphicFrameLocks noChangeAspect="1"/>
             </wp:cNvGraphicFramePr>
@@ -3882,7 +3867,7 @@
                     <pic:cNvPicPr/>
                   </pic:nvPicPr>
                   <pic:blipFill>
-                    <a:blip r:embed="rId9"/>
+                    <a:blip r:embed="rId10"/>
                     <a:stretch>
                       <a:fillRect/>
                     </a:stretch>
@@ -4287,7 +4272,7 @@
         <w:drawing>
           <wp:inline xmlns:a="http://schemas.openxmlformats.org/drawingml/2006/main" xmlns:pic="http://schemas.openxmlformats.org/drawingml/2006/picture">
             <wp:extent cx="5669280" cy="3902397"/>
-            <wp:docPr id="2" name="Picture 2"/>
+            <wp:docPr id="3" name="Picture 3"/>
             <wp:cNvGraphicFramePr>
               <a:graphicFrameLocks noChangeAspect="1"/>
             </wp:cNvGraphicFramePr>
@@ -4299,7 +4284,7 @@
                     <pic:cNvPicPr/>
                   </pic:nvPicPr>
                   <pic:blipFill>
-                    <a:blip r:embed="rId10"/>
+                    <a:blip r:embed="rId11"/>
                     <a:stretch>
                       <a:fillRect/>
                     </a:stretch>
@@ -4967,7 +4952,7 @@
         <w:drawing>
           <wp:inline xmlns:a="http://schemas.openxmlformats.org/drawingml/2006/main" xmlns:pic="http://schemas.openxmlformats.org/drawingml/2006/picture">
             <wp:extent cx="5669280" cy="2447446"/>
-            <wp:docPr id="3" name="Picture 3"/>
+            <wp:docPr id="4" name="Picture 4"/>
             <wp:cNvGraphicFramePr>
               <a:graphicFrameLocks noChangeAspect="1"/>
             </wp:cNvGraphicFramePr>
@@ -4979,7 +4964,7 @@
                     <pic:cNvPicPr/>
                   </pic:nvPicPr>
                   <pic:blipFill>
-                    <a:blip r:embed="rId11"/>
+                    <a:blip r:embed="rId12"/>
                     <a:stretch>
                       <a:fillRect/>
                     </a:stretch>
@@ -5290,7 +5275,7 @@
         <w:drawing>
           <wp:inline xmlns:a="http://schemas.openxmlformats.org/drawingml/2006/main" xmlns:pic="http://schemas.openxmlformats.org/drawingml/2006/picture">
             <wp:extent cx="5669280" cy="2445220"/>
-            <wp:docPr id="4" name="Picture 4"/>
+            <wp:docPr id="5" name="Picture 5"/>
             <wp:cNvGraphicFramePr>
               <a:graphicFrameLocks noChangeAspect="1"/>
             </wp:cNvGraphicFramePr>
@@ -5302,7 +5287,7 @@
                     <pic:cNvPicPr/>
                   </pic:nvPicPr>
                   <pic:blipFill>
-                    <a:blip r:embed="rId12"/>
+                    <a:blip r:embed="rId13"/>
                     <a:stretch>
                       <a:fillRect/>
                     </a:stretch>
@@ -5604,7 +5589,7 @@
         <w:drawing>
           <wp:inline xmlns:a="http://schemas.openxmlformats.org/drawingml/2006/main" xmlns:pic="http://schemas.openxmlformats.org/drawingml/2006/picture">
             <wp:extent cx="5669280" cy="1693890"/>
-            <wp:docPr id="5" name="Picture 5"/>
+            <wp:docPr id="6" name="Picture 6"/>
             <wp:cNvGraphicFramePr>
               <a:graphicFrameLocks noChangeAspect="1"/>
             </wp:cNvGraphicFramePr>
@@ -5616,7 +5601,7 @@
                     <pic:cNvPicPr/>
                   </pic:nvPicPr>
                   <pic:blipFill>
-                    <a:blip r:embed="rId13"/>
+                    <a:blip r:embed="rId14"/>
                     <a:stretch>
                       <a:fillRect/>
                     </a:stretch>

</xml_diff>

<commit_message>
fix(equations): resolve KaTeX text-mode underscore errors across manuscript and docs
</commit_message>
<xml_diff>
--- a/manuscript/manuscript.docx
+++ b/manuscript/manuscript.docx
@@ -1818,7 +1818,7 @@
           <w:i/>
           <w:sz w:val="23"/>
         </w:rPr>
-        <w:t>EI = \frac{D_{\text{frontal\_horns}}}{D_{\text{inner\_skull}}}</w:t>
+        <w:t>EI = \frac{D_{\text{frontal horns}}}{D_{\text{inner skull}}}</w:t>
       </w:r>
     </w:p>
     <w:p>
@@ -1897,7 +1897,7 @@
           <w:rFonts w:ascii="Cambria Math" w:hAnsi="Cambria Math"/>
           <w:i/>
         </w:rPr>
-        <w:t>D_{\text{inner\_skull}}(z)</w:t>
+        <w:t>D_{\text{inner skull}}(z)</w:t>
       </w:r>
       <w:r>
         <w:t xml:space="preserve">. Bilateral frontal horn contours are identified via regional intensity valleys bounded by the caudate nuclei, measuring </w:t>
@@ -1907,7 +1907,7 @@
           <w:rFonts w:ascii="Cambria Math" w:hAnsi="Cambria Math"/>
           <w:i/>
         </w:rPr>
-        <w:t>D_{\text{frontal\_horns}}(z)</w:t>
+        <w:t>D_{\text{frontal horns}}(z)</w:t>
       </w:r>
       <w:r>
         <w:t>. The slice maximizing the ventricular span while satisfying anatomical symmetry constraints is selected. While this automated caliper method provides highly reproducible geometric ratios decoupled from slice blur, clinical translation requires validation against human radiologist measurements, as discussed in Section 4.</w:t>
@@ -1955,7 +1955,7 @@
           <w:i/>
           <w:sz w:val="23"/>
         </w:rPr>
-        <w:t>PEF = \frac{V_{\text{parenchymal\_envelope}}}{V_{\text{dilated\_cranial\_envelope}}}</w:t>
+        <w:t>PEF = \frac{V_{\text{parenchymal envelope}}}{V_{\text{cranial envelope}}}</w:t>
       </w:r>
     </w:p>
     <w:p>
@@ -1996,7 +1996,7 @@
           <w:rFonts w:ascii="Cambria Math" w:hAnsi="Cambria Math"/>
           <w:i/>
         </w:rPr>
-        <w:t>V_{\text{parenchymal\_envelope}}</w:t>
+        <w:t>V_{\text{parenchymal envelope}}</w:t>
       </w:r>
       <w:r>
         <w:t xml:space="preserve">), and derives the intracranial envelope via morphological binary dilation (iterations=2; </w:t>
@@ -2006,7 +2006,7 @@
           <w:rFonts w:ascii="Cambria Math" w:hAnsi="Cambria Math"/>
           <w:i/>
         </w:rPr>
-        <w:t>V_{\text{dilated\_cranial\_envelope}}</w:t>
+        <w:t>V_{\text{cranial envelope}}</w:t>
       </w:r>
       <w:r>
         <w:t>). Consequently, PEF represents an empirical envelope ratio rather than an atlas-calibrated volumetric parenchymal fraction. As detailed in Section 4, raw envelope volumes in thick-slice series operate as upper-bound geometric proxies rather than exact adult anatomical parenchymal volumes.</w:t>

</xml_diff>